<commit_message>
docs: sync technical regulations with approved Moderator, Store and dynamic SSC rules (v1.2)
</commit_message>
<xml_diff>
--- a/Omnia-Mundi_Technical_Regulations_RU_Revised.docx
+++ b/Omnia-Mundi_Technical_Regulations_RU_Revised.docx
@@ -206,7 +206,7 @@
                 <w:rFonts w:ascii="Liberation Sans" w:hAnsi="Liberation Sans"/>
                 <w:sz w:val="16"/>
               </w:rPr>
-              <w:t>1.1</w:t>
+              <w:t>1.2</w:t>
             </w:r>
           </w:p>
         </w:tc>
@@ -261,7 +261,7 @@
                 <w:b w:val="0"/>
                 <w:sz w:val="16"/>
               </w:rPr>
-              <w:t>24 октября 2026 года</w:t>
+              <w:t>26 октября 2026 года</w:t>
             </w:r>
           </w:p>
         </w:tc>
@@ -1649,6 +1649,7 @@
                 <w:rFonts w:ascii="Liberation Sans" w:hAnsi="Liberation Sans"/>
                 <w:sz w:val="16"/>
               </w:rPr>
+              <w:t>Принимает, хранит и передаёт товар; может работать как Home, Warehouse или Store Receiver. Стандартный депозит не переносится автоматически на консигнационный магазин.</w:t>
             </w:r>
             <w:r>
               <w:rPr>
@@ -1656,7 +1657,6 @@
                 <w:b w:val="0"/>
                 <w:sz w:val="16"/>
               </w:rPr>
-              <w:t>Вносит обеспечительный депозит, принимает отправление, передаёт местной доставке, при возврате хранит товар по согласованным правилам</w:t>
             </w:r>
           </w:p>
         </w:tc>
@@ -1681,6 +1681,7 @@
                 <w:rFonts w:ascii="Liberation Sans" w:hAnsi="Liberation Sans"/>
                 <w:sz w:val="16"/>
               </w:rPr>
+              <w:t>20% P после закрытия сделки; возврат обычного депозита по правилам. Store Selling Cost (SSC) возмещается отдельно и не является прибылью.</w:t>
             </w:r>
             <w:r>
               <w:rPr>
@@ -1688,7 +1689,6 @@
                 <w:b w:val="0"/>
                 <w:sz w:val="16"/>
               </w:rPr>
-              <w:t>Полный возврат депозита по выполнению обязательств; 20% прибыли после успешного завершения</w:t>
             </w:r>
           </w:p>
         </w:tc>
@@ -1748,6 +1748,7 @@
                 <w:rFonts w:ascii="Liberation Sans" w:hAnsi="Liberation Sans"/>
                 <w:sz w:val="16"/>
               </w:rPr>
+              <w:t>Sender Curator сопровождает отправителя; Receiver Curator — получателя; Order Supervisor координирует конкретный заказ.</w:t>
             </w:r>
             <w:r>
               <w:rPr>
@@ -1755,7 +1756,6 @@
                 <w:b w:val="0"/>
                 <w:sz w:val="16"/>
               </w:rPr>
-              <w:t>Оформляет запрос, ведёт конкретную торговую цепочку, общается с участниками и перевозчиками, контролирует процесс</w:t>
             </w:r>
           </w:p>
         </w:tc>
@@ -1779,6 +1779,7 @@
                 <w:rFonts w:ascii="Liberation Sans" w:hAnsi="Liberation Sans"/>
                 <w:sz w:val="16"/>
               </w:rPr>
+              <w:t>Sender Curator — 5% P, Receiver Curator — 5% P, Order Supervisor — 10% P; всего 20% P после завершения.</w:t>
             </w:r>
             <w:r>
               <w:rPr>
@@ -1786,7 +1787,6 @@
                 <w:b w:val="0"/>
                 <w:sz w:val="16"/>
               </w:rPr>
-              <w:t>20% распределяемой прибыли после успешного завершения</w:t>
             </w:r>
           </w:p>
         </w:tc>
@@ -1827,12 +1827,24 @@
     </w:p>
     <w:p>
       <w:r>
-        <w:t>Ответственный Moderator принимает сообщение покупателя, уточняет сведения, формирует структурированную заявку, публикует её для подходящих исполнителей, проверяет предложения и согласовывает конечную цену с покупателем. После оплаты контролирует отправление, действия Receiver, коммуникации с перевозчиками, обращения, возвраты и конечное закрытие сделки.</w:t>
+        <w:t>Moderator работает как реальный человек в одной или нескольких специализациях: Sender Curator сопровождает Procurer/Manufacturer/Seller, Receiver Curator поддерживает Receiver, Order Supervisor уточняет запрос покупателя и ведёт конкретный заказ. Назначения и полномочия фиксируются по каждой сделке.</w:t>
       </w:r>
     </w:p>
     <w:p>
       <w:r>
-        <w:t>За конкретную операцию отвечает назначенный Moderator. Кто получает долю 20%, если общую карточку товара создал один Moderator, а заказ сопровождал другой, должно быть окончательно закреплено до запуска; рабочая модель связывает вознаграждение с управлением заказом. Отдельная оплата за пополнение каталога пока не утверждена.</w:t>
+        <w:t>В стандартной товарной сделке три функции Moderator получают соответственно 5%, 5% и 10% от распределяемой прибыли P; всего 20% P, не сверх этой доли. Один Moderator может выполнять несколько функций. Отдельное вознаграждение за создание карточки товара или общую помощь вне конкретной сделки не утверждено.</w:t>
+      </w:r>
+    </w:p>
+    <w:p>
+      <w:pPr/>
+      <w:r>
+        <w:t>Receiver имеет три специализации: Home Receiver — небольшие посылки; Warehouse Receiver — склад и учёт партий; Store Receiver — независимый физический магазин. Эти специализации не создают дополнительных категорий прибыли. Владелец Store Receiver самостоятельно финансирует аренду, открытие, оборудование, персонал и деятельность магазина; Omnia-Mundi предоставляет инфраструктуру бесплатной франшизы без вступительного платежа и регулярного роялти.</w:t>
+      </w:r>
+    </w:p>
+    <w:p>
+      <w:pPr/>
+      <w:r>
+        <w:t>Manufacturer может добровольно передавать Store Receiver товары на консигнацию без предварительного выкупа магазином. Магазин самостоятельно принимает или отклоняет ассортимент; условия поставки и владения товаром закрепляются договором. Omnia-Mundi не навязывает магазину товары.</w:t>
       </w:r>
     </w:p>
     <w:p>
@@ -2705,7 +2717,13 @@
     </w:p>
     <w:p>
       <w:r>
-        <w:t>До подтверждения покупки Customer видит полную итоговую цену. Дополнительно ему показывают первоначальную стоимость товара, стоимость каждого этапа доставки и обработки, применимые налоги и сборы, расчёт распределяемой прибыли и доли участников. Указанные выплаты не скрываются.</w:t>
+        <w:t>До подтверждения покупки Customer видит полную конечную цену и прозрачную структуру: цену закупки Procurer либо согласованную цену передачи Manufacturer/Seller, фактическую доставку, применимые налоги и расходы, распределяемую прибыль P. При продаже в физическом магазине отдельной строкой показывается Store Selling Cost (SSC), который оплачивает покупатель в составе цены товара.</w:t>
+      </w:r>
+    </w:p>
+    <w:p>
+      <w:pPr/>
+      <w:r>
+        <w:t>Store Selling Cost (SSC) — отдельная оплачиваемая Customer часть конечной цены при продаже через физический магазин. SSC компенсирует обоснованные затраты конкретного магазина на продажу, не является торговой прибылью и учитывается до расчёта P. SSC индивидуален для каждого магазина, зависит от расходов, числа товаров и других факторов и может изменяться ежедневно. Точная формула ещё не утверждена; фиксированные ставки и условные денежные примеры не устанавливаются.</w:t>
       </w:r>
     </w:p>
     <w:p>
@@ -2715,7 +2733,7 @@
     </w:p>
     <w:p>
       <w:r>
-        <w:t>Procurer, Manufacturer или Seller сначала оплачивает доставку до Receiver. Фактически понесённая стоимость этой доставки включается в расходы сделки. Депозит Receiver равен первоначальной стоимости товара плюс стоимость указанной доставки. Последующие перевозки, комиссии платёжного провайдера и применимые налоги учитываются отдельно при расчёте итоговой цены.</w:t>
+        <w:t>В стандартной сделке фактическая стоимость первой доставки, оплаченной отправителем, включается в расходы и возмещается именно оплатившей стороне без двойного учёта. Обычный Receiver предоставляет возвратный депозит по утверждённым правилам. Для магазинной консигнации условия обеспечения согласуются отдельно; нельзя автоматически переносить на неё стандартный депозит.</w:t>
       </w:r>
     </w:p>
     <w:tbl>
@@ -3186,6 +3204,7 @@
                 <w:rFonts w:ascii="Liberation Sans" w:hAnsi="Liberation Sans"/>
                 <w:sz w:val="16"/>
               </w:rPr>
+              <w:t>Три назначения: Sender Curator — 5%, Receiver Curator — 5%, Order Supervisor — 10% P; вместе 20% P.</w:t>
             </w:r>
             <w:r>
               <w:rPr>
@@ -3193,7 +3212,6 @@
                 <w:b w:val="0"/>
                 <w:sz w:val="16"/>
               </w:rPr>
-              <w:t>Вёл и сопровождал данную операцию</w:t>
             </w:r>
           </w:p>
         </w:tc>
@@ -3405,7 +3423,7 @@
     </w:p>
     <w:p>
       <w:r>
-        <w:t>Пять долей распределяются только из положительной прибыли после успешного завершения сделки. Депозит Receiver и возмещение первоначальных вложений источника товара не являются прибылью и не должны повторно включаться в выручку. Доля Protection Fund в размере 20% выделяется из распределяемой прибыли, а не вычитается из неё заранее второй раз.</w:t>
+        <w:t>Положительная распределяемая прибыль P после обоснованных расходов распределяется: один источник товара 20%, Receiver 20%, Sender Curator 5%, Receiver Curator 5%, Order Supervisor 10%, Omnia-Mundi 20%, Protection Fund 20%. Всего 100% P. SSC, депозит Receiver и возмещение издержек не являются прибылью. Protection Fund — отдельный резерв, не доход компании.</w:t>
       </w:r>
     </w:p>
     <w:p>
@@ -4150,7 +4168,7 @@
     </w:p>
     <w:p>
       <w:r>
-        <w:t>Добровольное вознаграждение распределяется поровну между Omnia-Mundi и всеми реально участвовавшими исполнителями. Если участвовал один человек, каждый из двух получателей получает 50%; если два человека — каждый из трёх получает одну треть; если Seller, Receiver и Moderator — все четверо, включая компанию, получают по 25%. Стандартная схема торговой прибыли и Protection Fund в этом расчёте не применяются.</w:t>
+        <w:t>Добровольное вознаграждение распределяется поровну между Omnia-Mundi и всеми реально участвовавшими исполнителями. Доля каждого получателя определяется делением суммы добровольного вознаграждения на число реально участвовавших исполнителей вместе с Omnia-Mundi. Стандартная схема распределения торговой прибыли и Protection Fund к этому вознаграждению не применяется.</w:t>
       </w:r>
     </w:p>
     <w:p>
@@ -6388,7 +6406,7 @@
         <w:spacing w:after="50"/>
       </w:pPr>
       <w:r>
-        <w:t>Порядок выплаты 20% Moderator, если карточку товара подготовил один участник, а конкретный заказ вёл другой. Пока рабочая модель предусматривает долю сопровождающему заказ Moderator; отдельное вознаграждение за создание карточки не утверждено.</w:t>
+        <w:t>Для Moderator утверждены три функции и распределение 5% / 5% / 10% от P; не вводить дополнительную долю 20%. Вопрос отдельной платы за пополнение каталога и помощь магазинам вне конкретных сделок не утверждён.</w:t>
       </w:r>
     </w:p>
     <w:p>
@@ -6656,6 +6674,7 @@
                 <w:rFonts w:ascii="Liberation Sans" w:hAnsi="Liberation Sans"/>
                 <w:sz w:val="16"/>
               </w:rPr>
+              <w:t>20% источнику товара, 20% Receiver, 5% Sender Curator, 5% Receiver Curator, 10% Order Supervisor, 20% Omnia-Mundi, 20% Protection Fund — от положительной распределяемой прибыли P.</w:t>
             </w:r>
             <w:r>
               <w:rPr>
@@ -6663,7 +6682,6 @@
                 <w:b w:val="0"/>
                 <w:sz w:val="16"/>
               </w:rPr>
-              <w:t>20% источнику товара, 20% Receiver, 20% Moderator, 20% Omnia-Mundi, 20% Protection Fund — от положительной распределяемой прибыли</w:t>
             </w:r>
           </w:p>
         </w:tc>
@@ -6854,6 +6872,7 @@
                 <w:rFonts w:ascii="Liberation Sans" w:hAnsi="Liberation Sans"/>
                 <w:sz w:val="16"/>
               </w:rPr>
+              <w:t>Обычный Receiver: возвратный депозит по согласованным правилам; 20% P после закрытия. Для Store Receiver SSC возмещается отдельно от прибыли; стандартный депозит нельзя автоматически применять к консигнации.</w:t>
             </w:r>
             <w:r>
               <w:rPr>
@@ -6861,7 +6880,6 @@
                 <w:b w:val="0"/>
                 <w:sz w:val="16"/>
               </w:rPr>
-              <w:t>Депозит = цена товара + первая доставка; возврат полностью после доставки или установленной невиновности; 20% прибыли позже</w:t>
             </w:r>
           </w:p>
         </w:tc>

</xml_diff>

<commit_message>
docs: update original regulation DOCX v1.3 with offline-only SSC scope
</commit_message>
<xml_diff>
--- a/Omnia-Mundi_Technical_Regulations_RU_Revised.docx
+++ b/Omnia-Mundi_Technical_Regulations_RU_Revised.docx
@@ -206,7 +206,7 @@
                 <w:rFonts w:ascii="Liberation Sans" w:hAnsi="Liberation Sans"/>
                 <w:sz w:val="16"/>
               </w:rPr>
-              <w:t>1.2</w:t>
+              <w:t>1.3</w:t>
             </w:r>
           </w:p>
         </w:tc>
@@ -595,7 +595,7 @@
     </w:p>
     <w:p>
       <w:r>
-        <w:t>На первом этапе Omnia-Mundi создаётся как веб-сайт с функциями маркетплейса и личными кабинетами участников. В дальнейшем могут появиться мобильные приложения. Компания организует торговые отношения и поддержку сделок, а цифровая система обеспечивает взаимодействие участников, обработку заказов и расчёты через уполномоченных платёжных провайдеров.</w:t>
+        <w:t>На первом этапе Omnia-Mundi создаётся как веб-сайт с функциями онлайн-маркетплейса и личными кабинетами участников. В дальнейшем могут появиться мобильные приложения и отдельная сеть физических магазинов Omnia-Mundi Stores. Срок открытия первых магазинов пока не установлен. Компания организует торговые отношения и поддержку сделок, а цифровая система обеспечивает взаимодействие участников, обработку заказов и расчёты через уполномоченных платёжных провайдеров. Расчёт Store Selling Cost (SSC) не является функцией первоначального онлайн-маркетплейса.</w:t>
       </w:r>
     </w:p>
     <w:p>
@@ -1681,7 +1681,7 @@
                 <w:rFonts w:ascii="Liberation Sans" w:hAnsi="Liberation Sans"/>
                 <w:sz w:val="16"/>
               </w:rPr>
-              <w:t>20% P после закрытия сделки; возврат обычного депозита по правилам. Store Selling Cost (SSC) возмещается отдельно и не является прибылью.</w:t>
+              <w:t>20% P после закрытия сделки; возврат обычного депозита по правилам. Только в будущих офлайн-продажах через действующий Store Receiver отдельно возмещается SSC; для обычных онлайн-заказов SSC не существует.</w:t>
             </w:r>
             <w:r>
               <w:rPr>
@@ -1838,7 +1838,7 @@
     <w:p>
       <w:pPr/>
       <w:r>
-        <w:t>Receiver имеет три специализации: Home Receiver — небольшие посылки; Warehouse Receiver — склад и учёт партий; Store Receiver — независимый физический магазин. Эти специализации не создают дополнительных категорий прибыли. Владелец Store Receiver самостоятельно финансирует аренду, открытие, оборудование, персонал и деятельность магазина; Omnia-Mundi предоставляет инфраструктуру бесплатной франшизы без вступительного платежа и регулярного роялти.</w:t>
+        <w:t>Receiver имеет три специализации: Home Receiver — небольшие посылки; Warehouse Receiver — склад и учёт партий; Store Receiver — будущий независимый физический магазин. Эти специализации не создают дополнительных категорий прибыли. Владелец Store Receiver самостоятельно финансирует аренду, открытие, оборудование, персонал и деятельность магазина; Omnia-Mundi предоставляет инфраструктуру бесплатной франшизы без вступительного платежа и регулярного роялти. Открытие таких магазинов предусматривается отдельным последующим этапом, а не обязательной частью запуска сайта.</w:t>
       </w:r>
     </w:p>
     <w:p>
@@ -2717,13 +2717,13 @@
     </w:p>
     <w:p>
       <w:r>
-        <w:t>До подтверждения покупки Customer видит полную конечную цену и прозрачную структуру: цену закупки Procurer либо согласованную цену передачи Manufacturer/Seller, фактическую доставку, применимые налоги и расходы, распределяемую прибыль P. При продаже в физическом магазине отдельной строкой показывается Store Selling Cost (SSC), который оплачивает покупатель в составе цены товара.</w:t>
+        <w:t>До подтверждения покупки Customer видит полную конечную цену и прозрачную структуру: цену закупки Procurer либо согласованную цену передачи Manufacturer/Seller, фактическую доставку, применимые налоги и расходы, распределяемую прибыль P. Для обычных заказов онлайн-маркетплейса Store Selling Cost (SSC) не применяется и не рассчитывается, в том числе если товар выдаёт Receiver или покупатель забирает онлайн-заказ в пункте выдачи. Лишь после фактического открытия физического Omnia-Mundi Store SSC предусматривается отдельной строкой конечной цены товаров, продаваемых офлайн в этом магазине.</w:t>
       </w:r>
     </w:p>
     <w:p>
       <w:pPr/>
       <w:r>
-        <w:t>Store Selling Cost (SSC) — отдельная оплачиваемая Customer часть конечной цены при продаже через физический магазин. SSC компенсирует обоснованные затраты конкретного магазина на продажу, не является торговой прибылью и учитывается до расчёта P. SSC индивидуален для каждого магазина, зависит от расходов, числа товаров и других факторов и может изменяться ежедневно. Точная формула ещё не утверждена; фиксированные ставки и условные денежные примеры не устанавливаются.</w:t>
+        <w:t>Store Selling Cost (SSC) — будущая отдельная оплачиваемая Customer часть конечной цены исключительно при офлайн-продаже товара через действующий физический Omnia-Mundi Store. До начала реальной работы конкретного магазина его SSC не рассчитывается. После открытия SSC определяется индивидуально для магазина на основании обоснованных затрат, количества реализуемых товаров и других факторов; он может изменяться ежедневно. SSC возмещает расходы магазина, не является торговой прибылью и учитывается до расчёта P. В заказах через сайт, включая доставку или получение через Receiver, SSC отсутствует. Точная методика расчёта пока не утверждена; единых тарифов и условных денежных примеров нет.</w:t>
       </w:r>
     </w:p>
     <w:p>
@@ -3423,7 +3423,7 @@
     </w:p>
     <w:p>
       <w:r>
-        <w:t>Положительная распределяемая прибыль P после обоснованных расходов распределяется: один источник товара 20%, Receiver 20%, Sender Curator 5%, Receiver Curator 5%, Order Supervisor 10%, Omnia-Mundi 20%, Protection Fund 20%. Всего 100% P. SSC, депозит Receiver и возмещение издержек не являются прибылью. Protection Fund — отдельный резерв, не доход компании.</w:t>
+        <w:t>Положительная распределяемая прибыль P после обоснованных расходов распределяется: один источник товара 20%, Receiver 20%, Sender Curator 5%, Receiver Curator 5%, Order Supervisor 10%, Omnia-Mundi 20%, Protection Fund 20%. Всего 100% P. Только для будущих офлайн-продаж через действующий Omnia-Mundi Store отдельно учитывается SSC; для онлайн-сделок его нет. SSC, депозит Receiver и возмещение издержек не являются прибылью. Protection Fund — отдельный резерв, не доход компании.</w:t>
       </w:r>
     </w:p>
     <w:p>
@@ -6872,7 +6872,7 @@
                 <w:rFonts w:ascii="Liberation Sans" w:hAnsi="Liberation Sans"/>
                 <w:sz w:val="16"/>
               </w:rPr>
-              <w:t>Обычный Receiver: возвратный депозит по согласованным правилам; 20% P после закрытия. Для Store Receiver SSC возмещается отдельно от прибыли; стандартный депозит нельзя автоматически применять к консигнации.</w:t>
+              <w:t>Обычный Receiver: возвратный депозит по согласованным правилам; 20% P после закрытия. SSC относится исключительно к офлайн-продажам после открытия физического Omnia-Mundi Store, отдельно от прибыли. Онлайн-заказы, включая получение через Receiver, не содержат SSC; стандартный депозит нельзя автоматически переносить на магазинную консигнацию.</w:t>
             </w:r>
             <w:r>
               <w:rPr>
@@ -8164,7 +8164,7 @@
       <w:rPr>
         <w:sz w:val="15"/>
       </w:rPr>
-      <w:t xml:space="preserve">OMNIA-MUNDI · ПРОЕКТ ДОКУМЕНТА  |  24.10.2026     •     </w:t>
+      <w:t xml:space="preserve">OMNIA-MUNDI · ПРОЕКТ ДОКУМЕНТА  |  26.10.2026     •     </w:t>
     </w:r>
     <w:fldSimple w:instr="PAGE"/>
   </w:p>

</xml_diff>